<commit_message>
Record completed merges and preserve original MS94 text alongside encoding repairs
</commit_message>
<xml_diff>
--- a/docs/milestones/MS-94/MS-94.docx
+++ b/docs/milestones/MS-94/MS-94.docx
@@ -200,6 +200,16 @@
           <w:i w:val="0"/>
         </w:rPr>
         <w:t>Preserved earlier milestone record</w:t>
+      </w:r>
+    </w:p>
+    <w:p>
+      <w:pPr/>
+      <w:r>
+        <w:rPr>
+          <w:b w:val="0"/>
+          <w:i w:val="0"/>
+        </w:rPr>
+        <w:t>Only dash and prime character encoding has been repaired in the readable history below. The reconciliation source map retains the exact original UTF-8 text.</w:t>
       </w:r>
     </w:p>
     <w:p>
@@ -5049,7 +5059,7 @@
           <w:b/>
           <w:i w:val="0"/>
         </w:rPr>
-        <w:t>95% Wilson interval: 38.7%â€“78.1%; Stage B 03: 12/20 first-try passes (60%).</w:t>
+        <w:t>95% Wilson interval: 38.7%–78.1%; Stage B 03: 12/20 first-try passes (60%).</w:t>
       </w:r>
       <w:r>
         <w:rPr>
@@ -5305,7 +5315,7 @@
           <w:rPr>
             <w:color w:val="244D79"/>
           </w:rPr>
-          <w:t xml:space="preserve">equipment-06 Aâ€²1 plan</w:t>
+          <w:t xml:space="preserve">equipment-06 A′1 plan</w:t>
         </w:r>
       </w:hyperlink>
       <w:r>
@@ -5362,7 +5372,7 @@
           <w:b w:val="0"/>
           <w:i w:val="0"/>
         </w:rPr>
-        <w:t>false-rejection bound of 25.9% (26% rounded). Revised Aâ€²2 diagnostic qualification passed; fresh dated-source Aâ€²3 private-value invariance passed; B04 still requires its own prospective public freeze.</w:t>
+        <w:t>false-rejection bound of 25.9% (26% rounded). Revised A′2 diagnostic qualification passed; fresh dated-source A′3 private-value invariance passed; B04 still requires its own prospective public freeze.</w:t>
       </w:r>
       <w:r>
         <w:rPr>
@@ -5509,7 +5519,7 @@
           <w:rPr>
             <w:color w:val="244D79"/>
           </w:rPr>
-          <w:t xml:space="preserve">Aâ€²2 stopped</w:t>
+          <w:t xml:space="preserve">A′2 stopped</w:t>
         </w:r>
       </w:hyperlink>
       <w:r>
@@ -8873,7 +8883,7 @@
           <w:b w:val="0"/>
           <w:i w:val="0"/>
         </w:rPr>
-        <w:t>controlled causal improvement is claimed. Its 95% Wilson interval remains 5.7%â€“51.0%,</w:t>
+        <w:t>controlled causal improvement is claimed. Its 95% Wilson interval remains 5.7%–51.0%,</w:t>
       </w:r>
       <w:r>
         <w:rPr>
@@ -9113,7 +9123,7 @@
           <w:b/>
           <w:i w:val="0"/>
         </w:rPr>
-        <w:t>Stage B 02: 2/10 first-try passes (20%); 95% Wilson interval 5.7%â€“51.0%. Passes and six execution failures human-accepted; five comparison rejections retain a public-contract caveat.</w:t>
+        <w:t>Stage B 02: 2/10 first-try passes (20%); 95% Wilson interval 5.7%–51.0%. Passes and six execution failures human-accepted; five comparison rejections retain a public-contract caveat.</w:t>
       </w:r>
       <w:r>
         <w:rPr>

</xml_diff>